<commit_message>
complete credit risk analysis project
</commit_message>
<xml_diff>
--- a/Repot.docx
+++ b/Repot.docx
@@ -429,6 +429,9 @@
     </w:p>
     <w:p>
       <w:r>
+        <w:rPr>
+          <w:noProof/>
+        </w:rPr>
         <w:drawing>
           <wp:inline distT="0" distB="0" distL="0" distR="0" wp14:anchorId="77B7F58F" wp14:editId="2D28C125">
             <wp:extent cx="5705475" cy="3393232"/>
@@ -483,6 +486,9 @@
     </w:p>
     <w:p>
       <w:r>
+        <w:rPr>
+          <w:noProof/>
+        </w:rPr>
         <w:drawing>
           <wp:inline distT="0" distB="0" distL="0" distR="0" wp14:anchorId="0B525366" wp14:editId="6A018331">
             <wp:extent cx="5943600" cy="4434205"/>
@@ -521,7 +527,6 @@
       </w:r>
       <w:r>
         <w:rPr>
-          <w:rStyle w:val="font-claude-response-body"/>
           <w:rFonts w:ascii="Georgia" w:hAnsi="Georgia"/>
           <w:color w:val="FFFFFF"/>
           <w:shd w:val="clear" w:color="auto" w:fill="1F1F1E"/>
@@ -548,6 +553,9 @@
     </w:p>
     <w:p>
       <w:r>
+        <w:rPr>
+          <w:noProof/>
+        </w:rPr>
         <w:lastRenderedPageBreak/>
         <w:drawing>
           <wp:inline distT="0" distB="0" distL="0" distR="0" wp14:anchorId="3041BD1C" wp14:editId="3FCC7140">
@@ -600,6 +608,9 @@
     </w:p>
     <w:p>
       <w:r>
+        <w:rPr>
+          <w:noProof/>
+        </w:rPr>
         <w:lastRenderedPageBreak/>
         <w:drawing>
           <wp:inline distT="0" distB="0" distL="0" distR="0" wp14:anchorId="1D3B80C8" wp14:editId="48F965FE">
@@ -668,6 +679,9 @@
     </w:p>
     <w:p>
       <w:r>
+        <w:rPr>
+          <w:noProof/>
+        </w:rPr>
         <w:lastRenderedPageBreak/>
         <w:drawing>
           <wp:inline distT="0" distB="0" distL="0" distR="0" wp14:anchorId="34383893" wp14:editId="2D985C11">
@@ -724,6 +738,10 @@
       <w:r>
         <w:t xml:space="preserve"> clear income gap exists between the two groups. Non-defaulters have a median income of approximately $60,000, while defaulters sit closer to $40,000. Lower income is associated with higher default risk, suggesting that income should be weighted heavily alongside other factors — particularly loan grade and prior default history — when assessing borderline applications.</w:t>
       </w:r>
+    </w:p>
+    <w:p/>
+    <w:p/>
+    <w:p>
       <w:bookmarkStart w:id="0" w:name="_GoBack"/>
       <w:bookmarkEnd w:id="0"/>
     </w:p>

</xml_diff>